<commit_message>
docs: clarify shared Config Set usage in beginner guides
- Explain configuring Train-only model output through its Config Set
- Note that Train-only and Detect-only pipelines can share a Config Set
- Add pipeline setup and scheduling guidance to the Hawk Console guide
</commit_message>
<xml_diff>
--- a/Howto_Guides/Hawk_Console_Beginners_Guide.docx
+++ b/Howto_Guides/Hawk_Console_Beginners_Guide.docx
@@ -6219,6 +6219,11 @@
       </w:r>
     </w:p>
     <w:p>
+      <w:r>
+        <w:t>Configure and schedule Pipelines through the LogHawk Web UI and the CronJob launcher. You can use the same Config Set for Train-only and Detect-only pipelines, with separate training and detection inputs and the same RustFS/Internal S3 output bucket and batch folder. See the LogHawk Web UI Beginner Guide for the steps.</w:t>
+      </w:r>
+    </w:p>
+    <w:p>
       <w:pPr>
         <w:pStyle w:val="Heading1"/>
       </w:pPr>

</xml_diff>

<commit_message>
docs: explain audit records and collector evidence storage
- Document AI audit, collector execution, and task execution records
- Clarify saved redacted evidence versus compacted LLM input
- Explain output limits and task stdout/stderr redaction differences
- Distinguish AI, direct API, and local execution logging
- Describe request/run ID correlation and explanation retries
- Update README and both beginner guides
</commit_message>
<xml_diff>
--- a/Howto_Guides/Hawk_Console_Beginners_Guide.docx
+++ b/Howto_Guides/Hawk_Console_Beginners_Guide.docx
@@ -3510,6 +3510,756 @@
         <w:pStyle w:val="Heading2"/>
       </w:pPr>
       <w:r>
+        <w:t>Audit records, execution records, and saved evidence</w:t>
+      </w:r>
+    </w:p>
+    <w:p>
+      <w:r>
+        <w:t>All server records below use the database configured by LH_SERVER_DATABASE_URL.</w:t>
+      </w:r>
+    </w:p>
+    <w:tbl>
+      <w:tblPr>
+        <w:tblW w:type="auto" w:w="0"/>
+        <w:tblLayout w:type="fixed"/>
+        <w:tblLook w:firstColumn="1" w:firstRow="1" w:lastColumn="0" w:lastRow="0" w:noHBand="0" w:noVBand="1" w:val="04A0"/>
+        <w:tblBorders>
+          <w:top w:val="single" w:sz="4" w:color="D9D9D9"/>
+          <w:left w:val="single" w:sz="4" w:color="D9D9D9"/>
+          <w:bottom w:val="single" w:sz="4" w:color="D9D9D9"/>
+          <w:right w:val="single" w:sz="4" w:color="D9D9D9"/>
+          <w:insideH w:val="single" w:sz="4" w:color="D9D9D9"/>
+          <w:insideV w:val="single" w:sz="4" w:color="D9D9D9"/>
+        </w:tblBorders>
+      </w:tblPr>
+      <w:tblGrid>
+        <w:gridCol w:w="4997"/>
+        <w:gridCol w:w="4997"/>
+      </w:tblGrid>
+      <w:tr>
+        <w:trPr>
+          <w:tblHeader/>
+        </w:trPr>
+        <w:tc>
+          <w:tcPr>
+            <w:tcW w:type="dxa" w:w="2952"/>
+            <w:vAlign w:val="center"/>
+            <w:shd w:fill="E8EEF4"/>
+            <w:tcMar>
+              <w:top w:w="85" w:type="dxa"/>
+              <w:left w:w="85" w:type="dxa"/>
+              <w:bottom w:w="85" w:type="dxa"/>
+              <w:right w:w="85" w:type="dxa"/>
+            </w:tcMar>
+          </w:tcPr>
+          <w:p>
+            <w:pPr>
+              <w:spacing w:after="80"/>
+            </w:pPr>
+            <w:r>
+              <w:rPr>
+                <w:b/>
+                <w:color w:val="000000"/>
+                <w:sz w:val="18"/>
+              </w:rPr>
+              <w:t>Record</w:t>
+            </w:r>
+          </w:p>
+        </w:tc>
+        <w:tc>
+          <w:tcPr>
+            <w:tcW w:type="dxa" w:w="6192"/>
+            <w:vAlign w:val="center"/>
+            <w:shd w:fill="E8EEF4"/>
+            <w:tcMar>
+              <w:top w:w="85" w:type="dxa"/>
+              <w:left w:w="85" w:type="dxa"/>
+              <w:bottom w:w="85" w:type="dxa"/>
+              <w:right w:w="85" w:type="dxa"/>
+            </w:tcMar>
+          </w:tcPr>
+          <w:p>
+            <w:pPr>
+              <w:spacing w:after="80"/>
+            </w:pPr>
+            <w:r>
+              <w:rPr>
+                <w:b/>
+                <w:color w:val="000000"/>
+                <w:sz w:val="18"/>
+              </w:rPr>
+              <w:t>Stored information</w:t>
+            </w:r>
+          </w:p>
+        </w:tc>
+      </w:tr>
+      <w:tr>
+        <w:tc>
+          <w:tcPr>
+            <w:tcW w:type="dxa" w:w="2952"/>
+            <w:vAlign w:val="center"/>
+            <w:shd w:fill="FFFFFF"/>
+            <w:tcMar>
+              <w:top w:w="85" w:type="dxa"/>
+              <w:left w:w="85" w:type="dxa"/>
+              <w:bottom w:w="85" w:type="dxa"/>
+              <w:right w:w="85" w:type="dxa"/>
+            </w:tcMar>
+          </w:tcPr>
+          <w:p>
+            <w:pPr>
+              <w:spacing w:after="80"/>
+            </w:pPr>
+            <w:r>
+              <w:rPr>
+                <w:b w:val="0"/>
+                <w:color w:val="000000"/>
+                <w:sz w:val="18"/>
+              </w:rPr>
+              <w:t>llm_tool_requests</w:t>
+            </w:r>
+          </w:p>
+        </w:tc>
+        <w:tc>
+          <w:tcPr>
+            <w:tcW w:type="dxa" w:w="6192"/>
+            <w:vAlign w:val="center"/>
+            <w:shd w:fill="FFFFFF"/>
+            <w:tcMar>
+              <w:top w:w="85" w:type="dxa"/>
+              <w:left w:w="85" w:type="dxa"/>
+              <w:bottom w:w="85" w:type="dxa"/>
+              <w:right w:w="85" w:type="dxa"/>
+            </w:tcMar>
+          </w:tcPr>
+          <w:p>
+            <w:pPr>
+              <w:spacing w:after="80"/>
+            </w:pPr>
+            <w:r>
+              <w:rPr>
+                <w:b w:val="0"/>
+                <w:color w:val="000000"/>
+                <w:sz w:val="18"/>
+              </w:rPr>
+              <w:t>AI request owner, originating software, request status, and confirmation/explanation state</w:t>
+            </w:r>
+          </w:p>
+        </w:tc>
+      </w:tr>
+      <w:tr>
+        <w:tc>
+          <w:tcPr>
+            <w:tcW w:type="dxa" w:w="2952"/>
+            <w:vAlign w:val="center"/>
+            <w:shd w:fill="F5F7F9"/>
+            <w:tcMar>
+              <w:top w:w="85" w:type="dxa"/>
+              <w:left w:w="85" w:type="dxa"/>
+              <w:bottom w:w="85" w:type="dxa"/>
+              <w:right w:w="85" w:type="dxa"/>
+            </w:tcMar>
+          </w:tcPr>
+          <w:p>
+            <w:pPr>
+              <w:spacing w:after="80"/>
+            </w:pPr>
+            <w:r>
+              <w:rPr>
+                <w:b w:val="0"/>
+                <w:color w:val="000000"/>
+                <w:sz w:val="18"/>
+              </w:rPr>
+              <w:t>llm_tool_calls</w:t>
+            </w:r>
+          </w:p>
+        </w:tc>
+        <w:tc>
+          <w:tcPr>
+            <w:tcW w:type="dxa" w:w="6192"/>
+            <w:vAlign w:val="center"/>
+            <w:shd w:fill="F5F7F9"/>
+            <w:tcMar>
+              <w:top w:w="85" w:type="dxa"/>
+              <w:left w:w="85" w:type="dxa"/>
+              <w:bottom w:w="85" w:type="dxa"/>
+              <w:right w:w="85" w:type="dxa"/>
+            </w:tcMar>
+          </w:tcPr>
+          <w:p>
+            <w:pPr>
+              <w:spacing w:after="80"/>
+            </w:pPr>
+            <w:r>
+              <w:rPr>
+                <w:b w:val="0"/>
+                <w:color w:val="000000"/>
+                <w:sz w:val="18"/>
+              </w:rPr>
+              <w:t>AI discovery and execution events, collector/version, redacted arguments, evidence, status, timestamps, and execution run ID. Also records explanation attempts.</w:t>
+            </w:r>
+          </w:p>
+        </w:tc>
+      </w:tr>
+      <w:tr>
+        <w:tc>
+          <w:tcPr>
+            <w:tcW w:type="dxa" w:w="2952"/>
+            <w:vAlign w:val="center"/>
+            <w:shd w:fill="FFFFFF"/>
+            <w:tcMar>
+              <w:top w:w="85" w:type="dxa"/>
+              <w:left w:w="85" w:type="dxa"/>
+              <w:bottom w:w="85" w:type="dxa"/>
+              <w:right w:w="85" w:type="dxa"/>
+            </w:tcMar>
+          </w:tcPr>
+          <w:p>
+            <w:pPr>
+              <w:spacing w:after="80"/>
+            </w:pPr>
+            <w:r>
+              <w:rPr>
+                <w:b w:val="0"/>
+                <w:color w:val="000000"/>
+                <w:sz w:val="18"/>
+              </w:rPr>
+              <w:t>collector_runs</w:t>
+            </w:r>
+          </w:p>
+        </w:tc>
+        <w:tc>
+          <w:tcPr>
+            <w:tcW w:type="dxa" w:w="6192"/>
+            <w:vAlign w:val="center"/>
+            <w:shd w:fill="FFFFFF"/>
+            <w:tcMar>
+              <w:top w:w="85" w:type="dxa"/>
+              <w:left w:w="85" w:type="dxa"/>
+              <w:bottom w:w="85" w:type="dxa"/>
+              <w:right w:w="85" w:type="dxa"/>
+            </w:tcMar>
+          </w:tcPr>
+          <w:p>
+            <w:pPr>
+              <w:spacing w:after="80"/>
+            </w:pPr>
+            <w:r>
+              <w:rPr>
+                <w:b w:val="0"/>
+                <w:color w:val="000000"/>
+                <w:sz w:val="18"/>
+              </w:rPr>
+              <w:t>Built-in collector execution metadata: user ID, collector/version, argument names, status, timestamps, short result summary, and error type. Does not store full collector evidence.</w:t>
+            </w:r>
+          </w:p>
+        </w:tc>
+      </w:tr>
+      <w:tr>
+        <w:tc>
+          <w:tcPr>
+            <w:tcW w:type="dxa" w:w="2952"/>
+            <w:vAlign w:val="center"/>
+            <w:shd w:fill="F5F7F9"/>
+            <w:tcMar>
+              <w:top w:w="85" w:type="dxa"/>
+              <w:left w:w="85" w:type="dxa"/>
+              <w:bottom w:w="85" w:type="dxa"/>
+              <w:right w:w="85" w:type="dxa"/>
+            </w:tcMar>
+          </w:tcPr>
+          <w:p>
+            <w:pPr>
+              <w:spacing w:after="80"/>
+            </w:pPr>
+            <w:r>
+              <w:rPr>
+                <w:b w:val="0"/>
+                <w:color w:val="000000"/>
+                <w:sz w:val="18"/>
+              </w:rPr>
+              <w:t>task_runs</w:t>
+            </w:r>
+          </w:p>
+        </w:tc>
+        <w:tc>
+          <w:tcPr>
+            <w:tcW w:type="dxa" w:w="6192"/>
+            <w:vAlign w:val="center"/>
+            <w:shd w:fill="F5F7F9"/>
+            <w:tcMar>
+              <w:top w:w="85" w:type="dxa"/>
+              <w:left w:w="85" w:type="dxa"/>
+              <w:bottom w:w="85" w:type="dxa"/>
+              <w:right w:w="85" w:type="dxa"/>
+            </w:tcMar>
+          </w:tcPr>
+          <w:p>
+            <w:pPr>
+              <w:spacing w:after="80"/>
+            </w:pPr>
+            <w:r>
+              <w:rPr>
+                <w:b w:val="0"/>
+                <w:color w:val="000000"/>
+                <w:sz w:val="18"/>
+              </w:rPr>
+              <w:t>Custom Task/Collector execution metadata, user ID, artifact version reference, status, exit code, stdout, stderr, timestamps, and error type</w:t>
+            </w:r>
+          </w:p>
+        </w:tc>
+      </w:tr>
+    </w:tbl>
+    <w:p>
+      <w:pPr>
+        <w:pStyle w:val="Heading3"/>
+      </w:pPr>
+      <w:r>
+        <w:t>Saved collector evidence</w:t>
+      </w:r>
+    </w:p>
+    <w:p>
+      <w:r>
+        <w:t>For Web UI RCA Chat and signed-in Hawk Console AI collector calls, LogHawk saves the full returned, redacted collector evidence in llm_tool_calls.result_text before model compaction.</w:t>
+      </w:r>
+    </w:p>
+    <w:p>
+      <w:r>
+        <w:t>The LLM receives a smaller, compacted representation. This does not replace the saved evidence.</w:t>
+      </w:r>
+    </w:p>
+    <w:p>
+      <w:r>
+        <w:t>“Full returned” means the output received from the collector or runner:</w:t>
+      </w:r>
+    </w:p>
+    <w:p>
+      <w:pPr>
+        <w:pStyle w:val="ListBullet"/>
+      </w:pPr>
+      <w:r>
+        <w:t>Source collectors may limit returned records.</w:t>
+      </w:r>
+    </w:p>
+    <w:p>
+      <w:pPr>
+        <w:pStyle w:val="ListBullet"/>
+      </w:pPr>
+      <w:r>
+        <w:t>Custom script stdout and stderr are each capped at 100,000 characters, followed by a truncation marker when applicable.</w:t>
+      </w:r>
+    </w:p>
+    <w:p>
+      <w:pPr>
+        <w:pStyle w:val="ListBullet"/>
+      </w:pPr>
+      <w:r>
+        <w:t>Sensitive values are masked in the AI evidence record.</w:t>
+      </w:r>
+    </w:p>
+    <w:p>
+      <w:pPr>
+        <w:pStyle w:val="ListBullet"/>
+      </w:pPr>
+      <w:r>
+        <w:t>The separate task_runs stdout/stderr fields are stored directly from the runner and do not receive the AI evidence redaction step.</w:t>
+      </w:r>
+    </w:p>
+    <w:p>
+      <w:pPr>
+        <w:pStyle w:val="Heading3"/>
+      </w:pPr>
+      <w:r>
+        <w:t>Which execution paths create these records</w:t>
+      </w:r>
+    </w:p>
+    <w:tbl>
+      <w:tblPr>
+        <w:tblW w:type="auto" w:w="0"/>
+        <w:tblLayout w:type="fixed"/>
+        <w:tblLook w:firstColumn="1" w:firstRow="1" w:lastColumn="0" w:lastRow="0" w:noHBand="0" w:noVBand="1" w:val="04A0"/>
+        <w:tblBorders>
+          <w:top w:val="single" w:sz="4" w:color="D9D9D9"/>
+          <w:left w:val="single" w:sz="4" w:color="D9D9D9"/>
+          <w:bottom w:val="single" w:sz="4" w:color="D9D9D9"/>
+          <w:right w:val="single" w:sz="4" w:color="D9D9D9"/>
+          <w:insideH w:val="single" w:sz="4" w:color="D9D9D9"/>
+          <w:insideV w:val="single" w:sz="4" w:color="D9D9D9"/>
+        </w:tblBorders>
+      </w:tblPr>
+      <w:tblGrid>
+        <w:gridCol w:w="4997"/>
+        <w:gridCol w:w="4997"/>
+      </w:tblGrid>
+      <w:tr>
+        <w:trPr>
+          <w:tblHeader/>
+        </w:trPr>
+        <w:tc>
+          <w:tcPr>
+            <w:tcW w:type="dxa" w:w="2952"/>
+            <w:vAlign w:val="center"/>
+            <w:shd w:fill="E8EEF4"/>
+            <w:tcMar>
+              <w:top w:w="85" w:type="dxa"/>
+              <w:left w:w="85" w:type="dxa"/>
+              <w:bottom w:w="85" w:type="dxa"/>
+              <w:right w:w="85" w:type="dxa"/>
+            </w:tcMar>
+          </w:tcPr>
+          <w:p>
+            <w:pPr>
+              <w:spacing w:after="80"/>
+            </w:pPr>
+            <w:r>
+              <w:rPr>
+                <w:b/>
+                <w:color w:val="000000"/>
+                <w:sz w:val="18"/>
+              </w:rPr>
+              <w:t>Execution path</w:t>
+            </w:r>
+          </w:p>
+        </w:tc>
+        <w:tc>
+          <w:tcPr>
+            <w:tcW w:type="dxa" w:w="6192"/>
+            <w:vAlign w:val="center"/>
+            <w:shd w:fill="E8EEF4"/>
+            <w:tcMar>
+              <w:top w:w="85" w:type="dxa"/>
+              <w:left w:w="85" w:type="dxa"/>
+              <w:bottom w:w="85" w:type="dxa"/>
+              <w:right w:w="85" w:type="dxa"/>
+            </w:tcMar>
+          </w:tcPr>
+          <w:p>
+            <w:pPr>
+              <w:spacing w:after="80"/>
+            </w:pPr>
+            <w:r>
+              <w:rPr>
+                <w:b/>
+                <w:color w:val="000000"/>
+                <w:sz w:val="18"/>
+              </w:rPr>
+              <w:t>Records</w:t>
+            </w:r>
+          </w:p>
+        </w:tc>
+      </w:tr>
+      <w:tr>
+        <w:tc>
+          <w:tcPr>
+            <w:tcW w:type="dxa" w:w="2952"/>
+            <w:vAlign w:val="center"/>
+            <w:shd w:fill="FFFFFF"/>
+            <w:tcMar>
+              <w:top w:w="85" w:type="dxa"/>
+              <w:left w:w="85" w:type="dxa"/>
+              <w:bottom w:w="85" w:type="dxa"/>
+              <w:right w:w="85" w:type="dxa"/>
+            </w:tcMar>
+          </w:tcPr>
+          <w:p>
+            <w:pPr>
+              <w:spacing w:after="80"/>
+            </w:pPr>
+            <w:r>
+              <w:rPr>
+                <w:b w:val="0"/>
+                <w:color w:val="000000"/>
+                <w:sz w:val="18"/>
+              </w:rPr>
+              <w:t>AI invokes a built-in collector</w:t>
+            </w:r>
+          </w:p>
+        </w:tc>
+        <w:tc>
+          <w:tcPr>
+            <w:tcW w:type="dxa" w:w="6192"/>
+            <w:vAlign w:val="center"/>
+            <w:shd w:fill="FFFFFF"/>
+            <w:tcMar>
+              <w:top w:w="85" w:type="dxa"/>
+              <w:left w:w="85" w:type="dxa"/>
+              <w:bottom w:w="85" w:type="dxa"/>
+              <w:right w:w="85" w:type="dxa"/>
+            </w:tcMar>
+          </w:tcPr>
+          <w:p>
+            <w:pPr>
+              <w:spacing w:after="80"/>
+            </w:pPr>
+            <w:r>
+              <w:rPr>
+                <w:b w:val="0"/>
+                <w:color w:val="000000"/>
+                <w:sz w:val="18"/>
+              </w:rPr>
+              <w:t>AI audit records plus collector_runs</w:t>
+            </w:r>
+          </w:p>
+        </w:tc>
+      </w:tr>
+      <w:tr>
+        <w:tc>
+          <w:tcPr>
+            <w:tcW w:type="dxa" w:w="2952"/>
+            <w:vAlign w:val="center"/>
+            <w:shd w:fill="F5F7F9"/>
+            <w:tcMar>
+              <w:top w:w="85" w:type="dxa"/>
+              <w:left w:w="85" w:type="dxa"/>
+              <w:bottom w:w="85" w:type="dxa"/>
+              <w:right w:w="85" w:type="dxa"/>
+            </w:tcMar>
+          </w:tcPr>
+          <w:p>
+            <w:pPr>
+              <w:spacing w:after="80"/>
+            </w:pPr>
+            <w:r>
+              <w:rPr>
+                <w:b w:val="0"/>
+                <w:color w:val="000000"/>
+                <w:sz w:val="18"/>
+              </w:rPr>
+              <w:t>AI invokes a custom Collector Task</w:t>
+            </w:r>
+          </w:p>
+        </w:tc>
+        <w:tc>
+          <w:tcPr>
+            <w:tcW w:type="dxa" w:w="6192"/>
+            <w:vAlign w:val="center"/>
+            <w:shd w:fill="F5F7F9"/>
+            <w:tcMar>
+              <w:top w:w="85" w:type="dxa"/>
+              <w:left w:w="85" w:type="dxa"/>
+              <w:bottom w:w="85" w:type="dxa"/>
+              <w:right w:w="85" w:type="dxa"/>
+            </w:tcMar>
+          </w:tcPr>
+          <w:p>
+            <w:pPr>
+              <w:spacing w:after="80"/>
+            </w:pPr>
+            <w:r>
+              <w:rPr>
+                <w:b w:val="0"/>
+                <w:color w:val="000000"/>
+                <w:sz w:val="18"/>
+              </w:rPr>
+              <w:t>AI audit records plus task_runs</w:t>
+            </w:r>
+          </w:p>
+        </w:tc>
+      </w:tr>
+      <w:tr>
+        <w:tc>
+          <w:tcPr>
+            <w:tcW w:type="dxa" w:w="2952"/>
+            <w:vAlign w:val="center"/>
+            <w:shd w:fill="FFFFFF"/>
+            <w:tcMar>
+              <w:top w:w="85" w:type="dxa"/>
+              <w:left w:w="85" w:type="dxa"/>
+              <w:bottom w:w="85" w:type="dxa"/>
+              <w:right w:w="85" w:type="dxa"/>
+            </w:tcMar>
+          </w:tcPr>
+          <w:p>
+            <w:pPr>
+              <w:spacing w:after="80"/>
+            </w:pPr>
+            <w:r>
+              <w:rPr>
+                <w:b w:val="0"/>
+                <w:color w:val="000000"/>
+                <w:sz w:val="18"/>
+              </w:rPr>
+              <w:t>Human invokes /collect through the API</w:t>
+            </w:r>
+          </w:p>
+        </w:tc>
+        <w:tc>
+          <w:tcPr>
+            <w:tcW w:type="dxa" w:w="6192"/>
+            <w:vAlign w:val="center"/>
+            <w:shd w:fill="FFFFFF"/>
+            <w:tcMar>
+              <w:top w:w="85" w:type="dxa"/>
+              <w:left w:w="85" w:type="dxa"/>
+              <w:bottom w:w="85" w:type="dxa"/>
+              <w:right w:w="85" w:type="dxa"/>
+            </w:tcMar>
+          </w:tcPr>
+          <w:p>
+            <w:pPr>
+              <w:spacing w:after="80"/>
+            </w:pPr>
+            <w:r>
+              <w:rPr>
+                <w:b w:val="0"/>
+                <w:color w:val="000000"/>
+                <w:sz w:val="18"/>
+              </w:rPr>
+              <w:t>collector_runs for built-ins; task_runs for custom collectors. No AI evidence record.</w:t>
+            </w:r>
+          </w:p>
+        </w:tc>
+      </w:tr>
+      <w:tr>
+        <w:tc>
+          <w:tcPr>
+            <w:tcW w:type="dxa" w:w="2952"/>
+            <w:vAlign w:val="center"/>
+            <w:shd w:fill="F5F7F9"/>
+            <w:tcMar>
+              <w:top w:w="85" w:type="dxa"/>
+              <w:left w:w="85" w:type="dxa"/>
+              <w:bottom w:w="85" w:type="dxa"/>
+              <w:right w:w="85" w:type="dxa"/>
+            </w:tcMar>
+          </w:tcPr>
+          <w:p>
+            <w:pPr>
+              <w:spacing w:after="80"/>
+            </w:pPr>
+            <w:r>
+              <w:rPr>
+                <w:b w:val="0"/>
+                <w:color w:val="000000"/>
+                <w:sz w:val="18"/>
+              </w:rPr>
+              <w:t>Human invokes /task through the API</w:t>
+            </w:r>
+          </w:p>
+        </w:tc>
+        <w:tc>
+          <w:tcPr>
+            <w:tcW w:type="dxa" w:w="6192"/>
+            <w:vAlign w:val="center"/>
+            <w:shd w:fill="F5F7F9"/>
+            <w:tcMar>
+              <w:top w:w="85" w:type="dxa"/>
+              <w:left w:w="85" w:type="dxa"/>
+              <w:bottom w:w="85" w:type="dxa"/>
+              <w:right w:w="85" w:type="dxa"/>
+            </w:tcMar>
+          </w:tcPr>
+          <w:p>
+            <w:pPr>
+              <w:spacing w:after="80"/>
+            </w:pPr>
+            <w:r>
+              <w:rPr>
+                <w:b w:val="0"/>
+                <w:color w:val="000000"/>
+                <w:sz w:val="18"/>
+              </w:rPr>
+              <w:t>task_runs. No AI evidence record.</w:t>
+            </w:r>
+          </w:p>
+        </w:tc>
+      </w:tr>
+      <w:tr>
+        <w:tc>
+          <w:tcPr>
+            <w:tcW w:type="dxa" w:w="2952"/>
+            <w:vAlign w:val="center"/>
+            <w:shd w:fill="FFFFFF"/>
+            <w:tcMar>
+              <w:top w:w="85" w:type="dxa"/>
+              <w:left w:w="85" w:type="dxa"/>
+              <w:bottom w:w="85" w:type="dxa"/>
+              <w:right w:w="85" w:type="dxa"/>
+            </w:tcMar>
+          </w:tcPr>
+          <w:p>
+            <w:pPr>
+              <w:spacing w:after="80"/>
+            </w:pPr>
+            <w:r>
+              <w:rPr>
+                <w:b w:val="0"/>
+                <w:color w:val="000000"/>
+                <w:sz w:val="18"/>
+              </w:rPr>
+              <w:t>Local /taskrun or /collectrun</w:t>
+            </w:r>
+          </w:p>
+        </w:tc>
+        <w:tc>
+          <w:tcPr>
+            <w:tcW w:type="dxa" w:w="6192"/>
+            <w:vAlign w:val="center"/>
+            <w:shd w:fill="FFFFFF"/>
+            <w:tcMar>
+              <w:top w:w="85" w:type="dxa"/>
+              <w:left w:w="85" w:type="dxa"/>
+              <w:bottom w:w="85" w:type="dxa"/>
+              <w:right w:w="85" w:type="dxa"/>
+            </w:tcMar>
+          </w:tcPr>
+          <w:p>
+            <w:pPr>
+              <w:spacing w:after="80"/>
+            </w:pPr>
+            <w:r>
+              <w:rPr>
+                <w:b w:val="0"/>
+                <w:color w:val="000000"/>
+                <w:sz w:val="18"/>
+              </w:rPr>
+              <w:t>Output appears in the Console. These paths do not create the server execution/audit records above. Command history is separate.</w:t>
+            </w:r>
+          </w:p>
+        </w:tc>
+      </w:tr>
+    </w:tbl>
+    <w:p>
+      <w:pPr>
+        <w:pStyle w:val="Heading3"/>
+      </w:pPr>
+      <w:r>
+        <w:t>Inspecting results</w:t>
+      </w:r>
+    </w:p>
+    <w:p>
+      <w:r>
+        <w:t>In Web UI, expand Collector evidence. In Hawk Console, select Show RCA Output.</w:t>
+      </w:r>
+    </w:p>
+    <w:p>
+      <w:r>
+        <w:t>Use the AI request ID to find its audit events. Where an execution run ID is recorded, it links to the corresponding collector_runs or task_runs record. A rejected request may have no execution run ID.</w:t>
+      </w:r>
+    </w:p>
+    <w:p>
+      <w:r>
+        <w:t>Retry AI Explanation reads saved evidence and records another explanation attempt. It does not rerun the collector.</w:t>
+      </w:r>
+    </w:p>
+    <w:p>
+      <w:pPr>
+        <w:pStyle w:val="Heading3"/>
+      </w:pPr>
+      <w:r>
+        <w:t>Application log files</w:t>
+      </w:r>
+    </w:p>
+    <w:p>
+      <w:r>
+        <w:t>API and worker console/file logs contain diagnostic messages and exceptions. They are separate from database audit and execution records and should not be treated as the complete evidence archive.</w:t>
+      </w:r>
+    </w:p>
+    <w:p>
+      <w:pPr>
+        <w:pStyle w:val="Heading2"/>
+      </w:pPr>
+      <w:r>
         <w:rPr>
           <w:color w:val="000000"/>
         </w:rPr>

</xml_diff>

<commit_message>
1. Record creation timestamps 2. Database retention cleanup 3. Pipeline scheduling guide 4. Reuse compatible installed Node.js during startup 5. Default arguments schema and execution-environment explanations 6. Unified built-in/custom collector script execution 7. Normalized execution output 8. Guide updates
</commit_message>
<xml_diff>
--- a/Howto_Guides/Hawk_Console_Beginners_Guide.docx
+++ b/Howto_Guides/Hawk_Console_Beginners_Guide.docx
@@ -181,6 +181,250 @@
     <w:p>
       <w:r>
         <w:t>If conda is unavailable in a new shell, initialize the Miniforge shell using the command printed by setup, then activate venv_hawkconsole. Windows uses a repository-local environment; Linux/macOS uses the named Conda environment. Setup also invokes setup_tools for venv_tools.</w:t>
+      </w:r>
+    </w:p>
+    <w:p>
+      <w:pPr>
+        <w:pStyle w:val="Heading2"/>
+      </w:pPr>
+      <w:r>
+        <w:t>If using Ollama</w:t>
+      </w:r>
+    </w:p>
+    <w:p>
+      <w:pPr>
+        <w:spacing w:after="120"/>
+      </w:pPr>
+      <w:r>
+        <w:t>Follow these steps only if LogHawk is configured to use Ollama. Install and start Ollama, then download the models configured in .env to the Ollama instance that LogHawk connects to. These steps do not apply to other LLM providers.</w:t>
+      </w:r>
+    </w:p>
+    <w:p>
+      <w:pPr>
+        <w:pStyle w:val="Heading3"/>
+      </w:pPr>
+      <w:r>
+        <w:t>Install and start Ollama</w:t>
+      </w:r>
+    </w:p>
+    <w:p>
+      <w:pPr>
+        <w:spacing w:after="120"/>
+      </w:pPr>
+      <w:r>
+        <w:t>Install Ollama on the computer that will serve the models, using the installer or instructions at https://ollama.com/download. Start the Ollama application or service. If it is already running, do not start a second server on the same port. If no server is running, start it with the command below and leave that terminal running.</w:t>
+      </w:r>
+    </w:p>
+    <w:p>
+      <w:pPr>
+        <w:spacing w:after="0"/>
+      </w:pPr>
+      <w:r>
+        <w:rPr>
+          <w:rFonts w:ascii="Consolas" w:hAnsi="Consolas"/>
+          <w:sz w:val="20"/>
+        </w:rPr>
+        <w:t>ollama serve</w:t>
+      </w:r>
+    </w:p>
+    <w:p>
+      <w:pPr>
+        <w:pStyle w:val="Heading3"/>
+      </w:pPr>
+      <w:r>
+        <w:t>Identify the configured models</w:t>
+      </w:r>
+    </w:p>
+    <w:p>
+      <w:pPr>
+        <w:spacing w:after="120"/>
+      </w:pPr>
+      <w:r>
+        <w:t>Check the .env used by the relevant LogHawk process. LH_LLM_PROVIDER=ollama selects Ollama for the LLM. LH_LLM_MODEL supplies general chat; LH_LLM_CODEASSIST_MODEL supplies task/code generation and falls back to LH_LLM_MODEL when blank; LH_LLM_TOOL_MODEL supplies RCA tool calling; LH_EMBEDDING_MODEL supplies RAG embeddings. Download each distinct model required by the features you will use.</w:t>
+      </w:r>
+    </w:p>
+    <w:p>
+      <w:pPr>
+        <w:spacing w:after="120"/>
+      </w:pPr>
+      <w:r>
+        <w:t>For example, with LH_LLM_MODEL=llama3.2:3b, a blank LH_LLM_CODEASSIST_MODEL, LH_LLM_TOOL_MODEL=qwen3:4b-instruct and LH_EMBEDDING_MODEL=ollama/nomic-embed-text, run the following commands against the intended Ollama instance. Wait for each download to finish. Replace the names if your configuration differs.</w:t>
+      </w:r>
+    </w:p>
+    <w:p>
+      <w:pPr>
+        <w:spacing w:after="0"/>
+      </w:pPr>
+      <w:r>
+        <w:rPr>
+          <w:rFonts w:ascii="Consolas" w:hAnsi="Consolas"/>
+          <w:sz w:val="20"/>
+        </w:rPr>
+        <w:t>ollama pull llama3.2:3b</w:t>
+      </w:r>
+    </w:p>
+    <w:p>
+      <w:pPr>
+        <w:spacing w:after="0"/>
+      </w:pPr>
+      <w:r>
+        <w:rPr>
+          <w:rFonts w:ascii="Consolas" w:hAnsi="Consolas"/>
+          <w:sz w:val="20"/>
+        </w:rPr>
+        <w:t>ollama pull qwen3:4b-instruct</w:t>
+      </w:r>
+    </w:p>
+    <w:p>
+      <w:pPr>
+        <w:spacing w:after="0"/>
+      </w:pPr>
+      <w:r>
+        <w:rPr>
+          <w:rFonts w:ascii="Consolas" w:hAnsi="Consolas"/>
+          <w:sz w:val="20"/>
+        </w:rPr>
+        <w:t>ollama pull nomic-embed-text</w:t>
+      </w:r>
+    </w:p>
+    <w:p>
+      <w:pPr>
+        <w:spacing w:after="120"/>
+      </w:pPr>
+      <w:r>
+        <w:t>ollama/ and ollama_chat/ are LiteLLM provider prefixes, not part of the Ollama model name. For ollama/nomic-embed-text, pull nomic-embed-text. Remove only the provider prefix; retain the actual model name, namespace when present, and tag. A blank code-assist setting does not require another model download.</w:t>
+      </w:r>
+    </w:p>
+    <w:p>
+      <w:pPr>
+        <w:spacing w:after="120"/>
+      </w:pPr>
+      <w:r>
+        <w:t>Also check LH_LLM_FALLBACK_MODELS for fallback models used by applicable LogHawk paths. Download the fallback models you intend to use. In the current configuration code, blank or unset LH_LLM_FALLBACK_MODELS with Ollama selects defaults llama3.2:1b, qwen2.5:0.5b and tinyllama; it does not disable fallback models. If using these defaults, pull them too:</w:t>
+      </w:r>
+    </w:p>
+    <w:p>
+      <w:pPr>
+        <w:spacing w:after="0"/>
+      </w:pPr>
+      <w:r>
+        <w:rPr>
+          <w:rFonts w:ascii="Consolas" w:hAnsi="Consolas"/>
+          <w:sz w:val="20"/>
+        </w:rPr>
+        <w:t>ollama pull llama3.2:1b</w:t>
+      </w:r>
+    </w:p>
+    <w:p>
+      <w:pPr>
+        <w:spacing w:after="0"/>
+      </w:pPr>
+      <w:r>
+        <w:rPr>
+          <w:rFonts w:ascii="Consolas" w:hAnsi="Consolas"/>
+          <w:sz w:val="20"/>
+        </w:rPr>
+        <w:t>ollama pull qwen2.5:0.5b</w:t>
+      </w:r>
+    </w:p>
+    <w:p>
+      <w:pPr>
+        <w:spacing w:after="0"/>
+      </w:pPr>
+      <w:r>
+        <w:rPr>
+          <w:rFonts w:ascii="Consolas" w:hAnsi="Consolas"/>
+          <w:sz w:val="20"/>
+        </w:rPr>
+        <w:t>ollama pull tinyllama</w:t>
+      </w:r>
+    </w:p>
+    <w:p>
+      <w:pPr>
+        <w:pStyle w:val="Heading3"/>
+      </w:pPr>
+      <w:r>
+        <w:t>Use the same Ollama instance as LogHawk</w:t>
+      </w:r>
+    </w:p>
+    <w:p>
+      <w:pPr>
+        <w:spacing w:after="120"/>
+      </w:pPr>
+      <w:r>
+        <w:t>LH_LLM_BASE_URL is the model server address used for chat and tool calls. LH_EMBEDDING_BASE_URL is the embedding server address. Models must exist on the instance reached at the applicable address. Downloading models to another Ollama installation will not make them available there. If those endpoints use different servers, download the required models on each corresponding server.</w:t>
+      </w:r>
+    </w:p>
+    <w:p>
+      <w:pPr>
+        <w:spacing w:after="120"/>
+      </w:pPr>
+      <w:r>
+        <w:t>For Web UI and signed-in Hawk Console, model calls use the API server configuration. The person using the browser or signed-in Console does not need a separate local model download if the configured server already has the models. For hawk --local, the Console uses its own configuration and endpoints; those endpoints may still point to a remote Ollama server.</w:t>
+      </w:r>
+    </w:p>
+    <w:p>
+      <w:pPr>
+        <w:spacing w:after="120"/>
+      </w:pPr>
+      <w:r>
+        <w:t>Run the pull and list commands using an Ollama CLI connected to the intended server. A CLI targeting localhost can see different models from LogHawk targeting a Windows host IP from WSL. localhost always refers to the computer or environment making the connection. Compare the configured endpoint with the CLI target, including any OLLAMA_HOST setting. Do not assume that Windows and WSL commands reach the same instance.</w:t>
+      </w:r>
+    </w:p>
+    <w:p>
+      <w:pPr>
+        <w:pStyle w:val="Heading3"/>
+      </w:pPr>
+      <w:r>
+        <w:t>Verify models and start LogHawk</w:t>
+      </w:r>
+    </w:p>
+    <w:p>
+      <w:pPr>
+        <w:spacing w:after="0"/>
+      </w:pPr>
+      <w:r>
+        <w:rPr>
+          <w:rFonts w:ascii="Consolas" w:hAnsi="Consolas"/>
+          <w:sz w:val="20"/>
+        </w:rPr>
+        <w:t>ollama ls</w:t>
+      </w:r>
+    </w:p>
+    <w:p>
+      <w:pPr>
+        <w:spacing w:after="0"/>
+      </w:pPr>
+      <w:r>
+        <w:rPr>
+          <w:rFonts w:ascii="Consolas" w:hAnsi="Consolas"/>
+          <w:sz w:val="20"/>
+        </w:rPr>
+        <w:t>ollama ps</w:t>
+      </w:r>
+    </w:p>
+    <w:p>
+      <w:pPr>
+        <w:spacing w:after="120"/>
+      </w:pPr>
+      <w:r>
+        <w:t>ollama ls lists installed models on the instance addressed by the CLI. Verify that the required names and tags are present. ollama ps lists currently loaded models; an empty list does not mean that installed models are missing. Model downloads are separate from installing LogHawk Python packages. Editing .env does not download a model.</w:t>
+      </w:r>
+    </w:p>
+    <w:p>
+      <w:pPr>
+        <w:spacing w:after="120"/>
+      </w:pPr>
+      <w:r>
+        <w:t>After changing .env model names or endpoint settings, restart the API server for Web UI and signed-in Console use, or restart Hawk Console for local mode. Then try ordinary chat, task generation, RAG and RCA as applicable. If a model is reported missing, verify its exact tag and the Ollama instance before downloading it again.</w:t>
+      </w:r>
+    </w:p>
+    <w:p>
+      <w:pPr>
+        <w:spacing w:after="120"/>
+      </w:pPr>
+      <w:r>
+        <w:t>Ollama command reference: https://docs.ollama.com/cli. For duplicate servers, GPU visibility and endpoint problems, see How_to_Troubleshoot_Ollama.docx in Howto_Guides.</w:t>
       </w:r>
     </w:p>
     <w:p>
@@ -2614,6 +2858,102 @@
     </w:p>
     <w:p>
       <w:pPr>
+        <w:pStyle w:val="Heading2"/>
+      </w:pPr>
+      <w:r>
+        <w:t>Shared script contract and execution flow</w:t>
+      </w:r>
+    </w:p>
+    <w:p>
+      <w:pPr>
+        <w:spacing w:after="120"/>
+      </w:pPr>
+      <w:r>
+        <w:t>General Tasks, Remediation Tasks, Rollback Tasks and custom Collectors use the same executable artifact contract. Python, Bash, PowerShell and Windows CMD scripts receive a JSON object in LH_RUNNER_ARGUMENTS_JSON and communicate through stdout, stderr and the process exit code. Packaged built-in collectors are complete Python scripts using this contract too. n8n workflow JSON is drafted and imported into customer-managed n8n; it is not executed by this runner.</w:t>
+      </w:r>
+    </w:p>
+    <w:p>
+      <w:pPr>
+        <w:spacing w:after="120"/>
+      </w:pPr>
+      <w:r>
+        <w:t>For API execution, LogHawk resolves the selected definition and version, checks approval, enablement and execution policy, validates arguments against the saved schema, and invokes lhrunner.run_artifact(). Python runs using venv_tools; other languages require their corresponding interpreter on the execution host. Windows CMD requires Windows. The runner captures bounded output and exit status; the API returns normalized output and records the execution. Administrator status does not bypass approval and enablement.</w:t>
+      </w:r>
+    </w:p>
+    <w:p>
+      <w:pPr>
+        <w:spacing w:after="120"/>
+      </w:pPr>
+      <w:r>
+        <w:t>Built-ins use run_builtin_collector(), which validates arguments and delegates to run_artifact(). Custom task kinds use task_runner.run_version(), which delegates to the same runner and then calls the same normalize_output() helper. Built-ins and custom scripts share the execution mechanism, but retain their own registry and audit records. Built-in failures still raise through the built-in adapter; custom execution results retain FAILED status and captured error output.</w:t>
+      </w:r>
+    </w:p>
+    <w:p>
+      <w:pPr>
+        <w:spacing w:after="120"/>
+      </w:pPr>
+      <w:r>
+        <w:t>/task and /collect execute on the API server and use server-side .env_tools. Local /taskrun and /collectrun execute on the Console computer, even when signed in, and use that computer’s .env_tools. Local development runs do not require enabled or approved versions. hawk --local uses local storage. Existing process environment values override .env_tools; the runner sets LH_RUNNER_ARGUMENTS_JSON for each invocation.</w:t>
+      </w:r>
+    </w:p>
+    <w:p>
+      <w:pPr>
+        <w:spacing w:after="120"/>
+      </w:pPr>
+      <w:r>
+        <w:t>AI-assisted RCA discovery currently selects eligible Collectors. Sharing the runner with General, Remediation and Rollback Tasks does not make those task kinds automatically available as AI tools. Collectors still need the appropriate schema, enabled and approved version, and AI-Assisted or Auto-Approved execution policy.</w:t>
+      </w:r>
+    </w:p>
+    <w:p>
+      <w:pPr>
+        <w:pStyle w:val="Heading2"/>
+      </w:pPr>
+      <w:r>
+        <w:t>Normalized output and raw captured output</w:t>
+      </w:r>
+    </w:p>
+    <w:p>
+      <w:pPr>
+        <w:spacing w:after="120"/>
+      </w:pPr>
+      <w:r>
+        <w:t>For a successful built-in call and for custom API task results, normalization adds summary and data while preserving stdout, stderr, exit_code, status and output_metadata. A JSON object containing data supplies the structured data field; a string summary is used when present. Other valid JSON becomes the data value. Plain text, mixed logs plus JSON, empty output or runner-truncated JSON is returned as data.text. Print one complete JSON document on stdout for structured evidence; send diagnostic messages to stderr.</w:t>
+      </w:r>
+    </w:p>
+    <w:p>
+      <w:pPr>
+        <w:spacing w:after="120"/>
+      </w:pPr>
+      <w:r>
+        <w:t>Example printed JSON: {"summary":"Found 2 pods.","data":{"count":2}}. The API exposes summary = "Found 2 pods." and data = {"count":2}. The raw stdout string is also retained, so escaped quotation marks inside stdout are expected. If the program prints [1,2], data is [1,2]. If it prints hello, data is {"text":"hello"}. These examples describe the normalized fields; the full response also contains execution metadata.</w:t>
+      </w:r>
+    </w:p>
+    <w:p>
+      <w:pPr>
+        <w:spacing w:after="120"/>
+      </w:pPr>
+      <w:r>
+        <w:t>When a printed object contains data, additional top-level payload fields are not promoted into the normalized result. Put important result metadata such as source_limit, included_items and truncated inside data. Raw stdout still preserves the original bounded output. Script fields cannot replace runner status, run ID or version metadata. Printing {"status":"FAILED"} with exit code 0 does not fail the execution: use a nonzero exit code.</w:t>
+      </w:r>
+    </w:p>
+    <w:p>
+      <w:pPr>
+        <w:spacing w:after="120"/>
+      </w:pPr>
+      <w:r>
+        <w:t>Normalization does not remove redaction or size limits. stdout and stderr are each capped at 100,000 characters, with a truncation marker when needed. output_metadata describes original, retained and returned lengths before redaction. AI-assisted RCA saves returned evidence after sensitive-value redaction in llm_tool_calls.result_text, before model compaction. LH_LLM_TOOL_MAX_RESULT_CHARS limits the model copy, not the already saved evidence. Redaction masks sensitive values; truncation omits content.</w:t>
+      </w:r>
+    </w:p>
+    <w:p>
+      <w:pPr>
+        <w:spacing w:after="120"/>
+      </w:pPr>
+      <w:r>
+        <w:t>Built-in runs use collector_runs; custom General, Remediation, Rollback and Collector runs use task_runs. The latter stores captured stdout/stderr before AI evidence redaction. Local custom /taskrun and /collectrun display captured stdout/stderr and exit code directly rather than the normalized API envelope, and do not create server execution records. Existing saved evidence is not rewritten by normalization.</w:t>
+      </w:r>
+    </w:p>
+    <w:p>
+      <w:pPr>
         <w:pStyle w:val="Heading1"/>
       </w:pPr>
       <w:r>
@@ -4253,6 +4593,38 @@
     <w:p>
       <w:r>
         <w:t>API and worker console/file logs contain diagnostic messages and exceptions. They are separate from database audit and execution records and should not be treated as the complete evidence archive.</w:t>
+      </w:r>
+    </w:p>
+    <w:p>
+      <w:pPr>
+        <w:pStyle w:val="Heading2"/>
+      </w:pPr>
+      <w:r>
+        <w:t>Review signed in investigations in Web UI RCA History</w:t>
+      </w:r>
+    </w:p>
+    <w:p>
+      <w:pPr>
+        <w:spacing w:after="120"/>
+      </w:pPr>
+      <w:r>
+        <w:t>For signed-in Console investigations, open Web UI &gt; AI-Assisted RCA &gt; RCA History and locate the request ID shown in Console RCA Output. The origin identifies console. Administrators and Power Users can view all users’ history; Users see their own. Local-only investigations are not included in server history.</w:t>
+      </w:r>
+    </w:p>
+    <w:p>
+      <w:pPr>
+        <w:spacing w:after="120"/>
+      </w:pPr>
+      <w:r>
+        <w:t>Overview shows the request and outcome; Evidence &amp; Inputs shows arguments, run IDs, saved evidence and truncation; AI Explanations retains explanation attempts; Timeline orders events; LLM Usage shows each model call, captured settings, tokens and prepared inputs. Several discovery_tool_selection cards are several LLM calls, not necessarily several executions. The same discovery result can be included in multiple calls.</w:t>
+      </w:r>
+    </w:p>
+    <w:p>
+      <w:pPr>
+        <w:spacing w:after="120"/>
+      </w:pPr>
+      <w:r>
+        <w:t>COMPLETED on a model invocation is distinct from COMPLETED on a collector run. Check run IDs to confirm collection. initial_explanation and explanation_retry use saved evidence without collector tools. A narration-correction retry is confirmed through API logs, not inferred solely from duplicate inputs. See the Web UI guide’s RCA History troubleshooting section for the worked timeline example and timeout diagnosis.</w:t>
       </w:r>
     </w:p>
     <w:p>

</xml_diff>